<commit_message>
Author und Manual fast fertig
</commit_message>
<xml_diff>
--- a/report/Manual Überarbeitung.docx
+++ b/report/Manual Überarbeitung.docx
@@ -16,6 +16,14 @@
       </w:r>
       <w:r>
         <w:br/>
+        <w:t>-4. Referenzfahrt Funktion über knopf ?</w:t>
+      </w:r>
+      <w:r>
+        <w:br/>
+        <w:t>-5. Punkt 10.?</w:t>
+      </w:r>
+      <w:r>
+        <w:br/>
         <w:t>- Referenzfahrt noch Möglich ?   (Functions.tex)</w:t>
       </w:r>
       <w:r>
@@ -29,6 +37,10 @@
       <w:r>
         <w:br/>
         <w:t>-Spezifikationen ausfüllen</w:t>
+      </w:r>
+      <w:r>
+        <w:br/>
+        <w:t>-3. Tikz Aktualisieren</w:t>
       </w:r>
       <w:r>
         <w:br/>

</xml_diff>